<commit_message>
MakeACE-compatible ACE layout (v0.2.0)
Verified against Kuju MakeACE 1.04 output (tests/makeace_parity.rs):
- row/level offsets relative to ACE body (file pos - 16)
- alpha textures: R,G,B,Mask(1-bit, alpha>32),Alpha; surface fmt 0x0E/0x11
- flags 0x05 for mipmapped structured textures
- transparent DXT1 declares R,G,B,Mask
- DXT mip levels below 4x4 stored as raw planar rows
- header name/creator text like MakeACE
</commit_message>
<xml_diff>
--- a/docs/PNG2ACE_User_Guide.docx
+++ b/docs/PNG2ACE_User_Guide.docx
@@ -2,29 +2,21 @@
 <file path=word/document.xml><?xml version="1.0" encoding="utf-8"?>
 <w:document xmlns:w="http://schemas.openxmlformats.org/wordprocessingml/2006/main" xmlns:m="http://schemas.openxmlformats.org/officeDocument/2006/math" xmlns:r="http://schemas.openxmlformats.org/officeDocument/2006/relationships" xmlns:o="urn:schemas-microsoft-com:office:office" xmlns:v="urn:schemas-microsoft-com:vml" xmlns:w10="urn:schemas-microsoft-com:office:word" xmlns:a="http://schemas.openxmlformats.org/drawingml/2006/main" xmlns:pic="http://schemas.openxmlformats.org/drawingml/2006/picture" xmlns:wp="http://schemas.openxmlformats.org/drawingml/2006/wordprocessingDrawing">
   <w:body>
-    <w:p>
-      <w:pPr>
-        <w:pStyle w:val="Title"/>
+    <w:bookmarkStart w:id="37" w:name="png2ace-user-guide"/>
+    <w:p>
+      <w:pPr>
+        <w:pStyle w:val="Heading1"/>
       </w:pPr>
       <w:r>
         <w:t xml:space="preserve">PNG2ACE User Guide</w:t>
       </w:r>
     </w:p>
-    <w:bookmarkStart w:id="36" w:name="png2ace-user-guide"/>
-    <w:p>
-      <w:pPr>
-        <w:pStyle w:val="Heading1"/>
-      </w:pPr>
-      <w:r>
-        <w:t xml:space="preserve">PNG2ACE User Guide</w:t>
-      </w:r>
-    </w:p>
     <w:p>
       <w:pPr>
         <w:pStyle w:val="FirstParagraph"/>
       </w:pPr>
       <w:r>
-        <w:t xml:space="preserve">Version: 0.1.0</w:t>
+        <w:t xml:space="preserve">Version: 0.2.0</w:t>
       </w:r>
     </w:p>
     <w:p>
@@ -298,7 +290,7 @@
               <w:pStyle w:val="Compact"/>
             </w:pPr>
             <w:r>
-              <w:t xml:space="preserve">Writes RGB unless the source has meaningful transparency.</w:t>
+              <w:t xml:space="preserve">Writes RGB unless the source has meaningful transparency, then RGB + 1-bit mask + 8-bit alpha (the MakeACE layout).</w:t>
             </w:r>
           </w:p>
         </w:tc>
@@ -322,18 +314,30 @@
               <w:pStyle w:val="Compact"/>
             </w:pPr>
             <w:r>
-              <w:t xml:space="preserve">Compressed textures without alpha.</w:t>
-            </w:r>
-          </w:p>
-        </w:tc>
-        <w:tc>
-          <w:tcPr/>
-          <w:p>
-            <w:pPr>
-              <w:pStyle w:val="Compact"/>
-            </w:pPr>
-            <w:r>
-              <w:t xml:space="preserve">Best compressed choice for opaque textures.</w:t>
+              <w:t xml:space="preserve">Compressed textures without alpha, or with simple cut-out transparency.</w:t>
+            </w:r>
+          </w:p>
+        </w:tc>
+        <w:tc>
+          <w:tcPr/>
+          <w:p>
+            <w:pPr>
+              <w:pStyle w:val="Compact"/>
+            </w:pPr>
+            <w:r>
+              <w:t xml:space="preserve">Best compressed choice for opaque textures. Transparent images get a 1-bit mask, like MakeACE</w:t>
+            </w:r>
+            <w:r>
+              <w:t xml:space="preserve"> </w:t>
+            </w:r>
+            <w:r>
+              <w:rPr>
+                <w:rStyle w:val="VerbatimChar"/>
+              </w:rPr>
+              <w:t xml:space="preserve">-dxt -trans</w:t>
+            </w:r>
+            <w:r>
+              <w:t xml:space="preserve">.</w:t>
             </w:r>
           </w:p>
         </w:tc>
@@ -507,6 +511,18 @@
       </w:pPr>
       <w:r>
         <w:t xml:space="preserve">Meaningful transparency produces an alpha-capable ACE format when the chosen output format supports alpha.</w:t>
+      </w:r>
+    </w:p>
+    <w:p>
+      <w:pPr>
+        <w:pStyle w:val="Compact"/>
+        <w:numPr>
+          <w:ilvl w:val="0"/>
+          <w:numId w:val="1002"/>
+        </w:numPr>
+      </w:pPr>
+      <w:r>
+        <w:t xml:space="preserve">Structured alpha output stores red, green, blue, a 1-bit mask and 8-bit alpha, exactly like Kuju’s MakeACE. A mask pixel is solid when its alpha is above 32.</w:t>
       </w:r>
     </w:p>
     <w:p>
@@ -2288,7 +2304,15 @@
         <w:pStyle w:val="FirstParagraph"/>
       </w:pPr>
       <w:r>
-        <w:t xml:space="preserve">Use the current PNG2ACE build and try Structured or DXT1 output first. Some legacy ACE readers misread unnecessary alpha data. PNG2ACE avoids writing alpha planes for fully opaque alpha channels and tiny near-opaque alpha noise.</w:t>
+        <w:t xml:space="preserve">Use PNG2ACE 0.2.0 or later. Earlier versions wrote the ACE row table and alpha channels in a slightly different layout from Kuju’s MakeACE, which some older ACE readers can show as stripes. 0.2.0 writes the same layout as MakeACE. PNG2ACE also avoids writing alpha planes for fully opaque alpha channels and tiny near-opaque alpha noise.</w:t>
+      </w:r>
+    </w:p>
+    <w:p>
+      <w:pPr>
+        <w:pStyle w:val="BodyText"/>
+      </w:pPr>
+      <w:r>
+        <w:t xml:space="preserve">If you still see stripes, reconvert the texture from the original PNG/TGA with the current build; ACE files made by older PNG2ACE versions are not fixed automatically.</w:t>
       </w:r>
     </w:p>
     <w:bookmarkEnd w:id="28"/>
@@ -2855,7 +2879,7 @@
       </w:tr>
     </w:tbl>
     <w:bookmarkEnd w:id="34"/>
-    <w:bookmarkStart w:id="35" w:name="notes-for-open-rails-and-msts-users"/>
+    <w:bookmarkStart w:id="36" w:name="notes-for-open-rails-and-msts-users"/>
     <w:p>
       <w:pPr>
         <w:pStyle w:val="Heading2"/>
@@ -2870,10 +2894,73 @@
       </w:pPr>
       <w:r>
         <w:t xml:space="preserve">PNG2ACE is designed for ACE textures used by Microsoft Train Simulator and Open Rails. Structured output is the most conservative choice. DXT output is smaller and may be useful for distribution or large texture sets, but test important textures in your target simulator or viewer before replacing working originals.</w:t>
+      </w:r>
+    </w:p>
+    <w:bookmarkStart w:id="35" w:name="compatibility-with-makeace"/>
+    <w:p>
+      <w:pPr>
+        <w:pStyle w:val="Heading3"/>
+      </w:pPr>
+      <w:r>
+        <w:t xml:space="preserve">Compatibility with MakeACE</w:t>
+      </w:r>
+    </w:p>
+    <w:p>
+      <w:pPr>
+        <w:pStyle w:val="FirstParagraph"/>
+      </w:pPr>
+      <w:r>
+        <w:t xml:space="preserve">PNG2ACE 0.2.0 writes ACE files in the same layout as Kuju’s original MakeACE 1.04: the same header values, channel list, row table and full-size pixel data. The differences you can expect are:</w:t>
+      </w:r>
+    </w:p>
+    <w:p>
+      <w:pPr>
+        <w:pStyle w:val="Compact"/>
+        <w:numPr>
+          <w:ilvl w:val="0"/>
+          <w:numId w:val="1010"/>
+        </w:numPr>
+      </w:pPr>
+      <w:r>
+        <w:t xml:space="preserve">Mipmaps: MakeACE copies one pixel from each 2x2 block; PNG2ACE averages the block, so its distant mipmaps look smoother.</w:t>
+      </w:r>
+    </w:p>
+    <w:p>
+      <w:pPr>
+        <w:pStyle w:val="Compact"/>
+        <w:numPr>
+          <w:ilvl w:val="0"/>
+          <w:numId w:val="1010"/>
+        </w:numPr>
+      </w:pPr>
+      <w:r>
+        <w:t xml:space="preserve">Alpha detection: MakeACE treats any alpha below 255 as transparency; PNG2ACE ignores tiny near-opaque alpha noise.</w:t>
+      </w:r>
+    </w:p>
+    <w:p>
+      <w:pPr>
+        <w:pStyle w:val="Compact"/>
+        <w:numPr>
+          <w:ilvl w:val="0"/>
+          <w:numId w:val="1010"/>
+        </w:numPr>
+      </w:pPr>
+      <w:r>
+        <w:t xml:space="preserve">PNG2ACE does not write zlib-compressed (</w:t>
+      </w:r>
+      <w:r>
+        <w:rPr>
+          <w:rStyle w:val="VerbatimChar"/>
+        </w:rPr>
+        <w:t xml:space="preserve">SIMISA@F</w:t>
+      </w:r>
+      <w:r>
+        <w:t xml:space="preserve">) ACE files.</w:t>
       </w:r>
     </w:p>
     <w:bookmarkEnd w:id="35"/>
     <w:bookmarkEnd w:id="36"/>
+    <w:bookmarkEnd w:id="37"/>
     <w:sectPr>
       <w:footnotePr>
         <w:numRestart w:val="eachSect"/>
@@ -3254,6 +3341,9 @@
     <w:abstractNumId w:val="991"/>
   </w:num>
   <w:num w:numId="1009">
+    <w:abstractNumId w:val="991"/>
+  </w:num>
+  <w:num w:numId="1010">
     <w:abstractNumId w:val="991"/>
   </w:num>
 </w:numbering>

</xml_diff>

<commit_message>
Release 1.2 (version 1.2.0)
</commit_message>
<xml_diff>
--- a/docs/PNG2ACE_User_Guide.docx
+++ b/docs/PNG2ACE_User_Guide.docx
@@ -16,7 +16,7 @@
         <w:pStyle w:val="FirstParagraph"/>
       </w:pPr>
       <w:r>
-        <w:t xml:space="preserve">Version: 0.2.0</w:t>
+        <w:t xml:space="preserve">Version: 1.2.0</w:t>
       </w:r>
     </w:p>
     <w:p>
@@ -2304,7 +2304,7 @@
         <w:pStyle w:val="FirstParagraph"/>
       </w:pPr>
       <w:r>
-        <w:t xml:space="preserve">Use PNG2ACE 0.2.0 or later. Earlier versions wrote the ACE row table and alpha channels in a slightly different layout from Kuju’s MakeACE, which some older ACE readers can show as stripes. 0.2.0 writes the same layout as MakeACE. PNG2ACE also avoids writing alpha planes for fully opaque alpha channels and tiny near-opaque alpha noise.</w:t>
+        <w:t xml:space="preserve">Use PNG2ACE 1.2 or later. Earlier versions wrote the ACE row table and alpha channels in a slightly different layout from Kuju’s MakeACE, which some older ACE readers can show as stripes. 1.2 writes the same layout as MakeACE. PNG2ACE also avoids writing alpha planes for fully opaque alpha channels and tiny near-opaque alpha noise.</w:t>
       </w:r>
     </w:p>
     <w:p>
@@ -2910,7 +2910,7 @@
         <w:pStyle w:val="FirstParagraph"/>
       </w:pPr>
       <w:r>
-        <w:t xml:space="preserve">PNG2ACE 0.2.0 writes ACE files in the same layout as Kuju’s original MakeACE 1.04: the same header values, channel list, row table and full-size pixel data. The differences you can expect are:</w:t>
+        <w:t xml:space="preserve">PNG2ACE 1.2 writes ACE files in the same layout as Kuju’s original MakeACE 1.04: the same header values, channel list, row table and full-size pixel data. The differences you can expect are:</w:t>
       </w:r>
     </w:p>
     <w:p>

</xml_diff>